<commit_message>
manuscript: add Zenodo DOI (10.5281/zenodo.19503595), GitHub and Streamlit URLs to main text, supplementary, and cover letter
Co-Authored-By: Claude Opus 4.6 (1M context) <noreply@anthropic.com>
</commit_message>
<xml_diff>
--- a/outputs/PathwayBench_CoverLetter.docx
+++ b/outputs/PathwayBench_CoverLetter.docx
@@ -44,6 +44,11 @@
       </w:r>
     </w:p>
     <w:p/>
+    <w:p>
+      <w:r>
+        <w:t>All code, data, figures, and an interactive method-recommendation application are publicly available under a Zenodo DOI: https://doi.org/10.5281/zenodo.19503595 (GitHub: https://github.com/fadhlyemen/PathwayBench; Streamlit app: https://pathwaybench-xrdxczzdpeahvcinxwbrcq.streamlit.app). The manuscript has not been submitted elsewhere.</w:t>
+      </w:r>
+    </w:p>
     <w:p>
       <w:r>
         <w:t>Sincerely,</w:t>

</xml_diff>